<commit_message>
Deploy preview for PR 600 🛫
</commit_message>
<xml_diff>
--- a/pr-preview/pr-600/vignettes/articles/version-crosswalk-1.3-to-1.4.docx
+++ b/pr-preview/pr-600/vignettes/articles/version-crosswalk-1.3-to-1.4.docx
@@ -1699,70 +1699,70 @@
         <w:rPr>
           <w:rStyle w:val="VerbatimChar"/>
         </w:rPr>
-        <w:t xml:space="preserve">#&gt;     age id    antigen_iso     value</w:t>
-      </w:r>
-      <w:r>
-        <w:br/>
-      </w:r>
-      <w:r>
-        <w:rPr>
-          <w:rStyle w:val="VerbatimChar"/>
-        </w:rPr>
-        <w:t xml:space="preserve">#&gt;   &lt;dbl&gt; &lt;chr&gt; &lt;chr&gt;           &lt;dbl&gt;</w:t>
-      </w:r>
-      <w:r>
-        <w:br/>
-      </w:r>
-      <w:r>
-        <w:rPr>
-          <w:rStyle w:val="VerbatimChar"/>
-        </w:rPr>
-        <w:t xml:space="preserve">#&gt; 1 18.1  1     HlyE_IgA       22.4  </w:t>
-      </w:r>
-      <w:r>
-        <w:br/>
-      </w:r>
-      <w:r>
-        <w:rPr>
-          <w:rStyle w:val="VerbatimChar"/>
-        </w:rPr>
-        <w:t xml:space="preserve">#&gt; 2 18.1  1     HlyE_IgG    47534.   </w:t>
-      </w:r>
-      <w:r>
-        <w:br/>
-      </w:r>
-      <w:r>
-        <w:rPr>
-          <w:rStyle w:val="VerbatimChar"/>
-        </w:rPr>
-        <w:t xml:space="preserve">#&gt; 3  1.03 2     HlyE_IgA        0.431</w:t>
-      </w:r>
-      <w:r>
-        <w:br/>
-      </w:r>
-      <w:r>
-        <w:rPr>
-          <w:rStyle w:val="VerbatimChar"/>
-        </w:rPr>
-        <w:t xml:space="preserve">#&gt; 4  1.03 2     HlyE_IgG        0.386</w:t>
-      </w:r>
-      <w:r>
-        <w:br/>
-      </w:r>
-      <w:r>
-        <w:rPr>
-          <w:rStyle w:val="VerbatimChar"/>
-        </w:rPr>
-        <w:t xml:space="preserve">#&gt; 5 18.7  3     HlyE_IgA        0.226</w:t>
-      </w:r>
-      <w:r>
-        <w:br/>
-      </w:r>
-      <w:r>
-        <w:rPr>
-          <w:rStyle w:val="VerbatimChar"/>
-        </w:rPr>
-        <w:t xml:space="preserve">#&gt; 6 18.7  3     HlyE_IgG        1.74</w:t>
+        <w:t xml:space="preserve">#&gt;     age id    antigen_iso value</w:t>
+      </w:r>
+      <w:r>
+        <w:br/>
+      </w:r>
+      <w:r>
+        <w:rPr>
+          <w:rStyle w:val="VerbatimChar"/>
+        </w:rPr>
+        <w:t xml:space="preserve">#&gt;   &lt;dbl&gt; &lt;chr&gt; &lt;chr&gt;       &lt;dbl&gt;</w:t>
+      </w:r>
+      <w:r>
+        <w:br/>
+      </w:r>
+      <w:r>
+        <w:rPr>
+          <w:rStyle w:val="VerbatimChar"/>
+        </w:rPr>
+        <w:t xml:space="preserve">#&gt; 1 16.0  1     HlyE_IgA    8.08 </w:t>
+      </w:r>
+      <w:r>
+        <w:br/>
+      </w:r>
+      <w:r>
+        <w:rPr>
+          <w:rStyle w:val="VerbatimChar"/>
+        </w:rPr>
+        <w:t xml:space="preserve">#&gt; 2 16.0  1     HlyE_IgG    5.31 </w:t>
+      </w:r>
+      <w:r>
+        <w:br/>
+      </w:r>
+      <w:r>
+        <w:rPr>
+          <w:rStyle w:val="VerbatimChar"/>
+        </w:rPr>
+        <w:t xml:space="preserve">#&gt; 3  3.48 2     HlyE_IgA    2.28 </w:t>
+      </w:r>
+      <w:r>
+        <w:br/>
+      </w:r>
+      <w:r>
+        <w:rPr>
+          <w:rStyle w:val="VerbatimChar"/>
+        </w:rPr>
+        <w:t xml:space="preserve">#&gt; 4  3.48 2     HlyE_IgG    7.84 </w:t>
+      </w:r>
+      <w:r>
+        <w:br/>
+      </w:r>
+      <w:r>
+        <w:rPr>
+          <w:rStyle w:val="VerbatimChar"/>
+        </w:rPr>
+        <w:t xml:space="preserve">#&gt; 5  9.01 3     HlyE_IgA    0.287</w:t>
+      </w:r>
+      <w:r>
+        <w:br/>
+      </w:r>
+      <w:r>
+        <w:rPr>
+          <w:rStyle w:val="VerbatimChar"/>
+        </w:rPr>
+        <w:t xml:space="preserve">#&gt; 6  9.01 3     HlyE_IgG    0.830</w:t>
       </w:r>
       <w:r>
         <w:br/>

</xml_diff>